<commit_message>
docs: add project documentation and specifications
</commit_message>
<xml_diff>
--- a/docs/api-contract.docx
+++ b/docs/api-contract.docx
@@ -401,6 +401,271 @@
                 <w:sz w:val="20"/>
               </w:rPr>
               <w:t>Mô tả chức năng</w:t>
+            </w:r>
+          </w:p>
+        </w:tc>
+      </w:tr>
+      <w:tr>
+        <w:tc>
+          <w:tcPr>
+            <w:tcW w:type="dxa" w:w="1872"/>
+            <w:shd w:fill="FFFFFF"/>
+            <w:tcMar>
+              <w:top w:w="120" w:type="dxa"/>
+              <w:bottom w:w="120" w:type="dxa"/>
+              <w:left w:w="160" w:type="dxa"/>
+              <w:right w:w="160" w:type="dxa"/>
+            </w:tcMar>
+            <w:vAlign w:val="center"/>
+          </w:tcPr>
+          <w:p>
+            <w:pPr>
+              <w:spacing w:before="20" w:after="20" w:line="276" w:lineRule="auto"/>
+            </w:pPr>
+            <w:r>
+              <w:rPr>
+                <w:b/>
+              </w:rPr>
+              <w:t>System</w:t>
+            </w:r>
+          </w:p>
+        </w:tc>
+        <w:tc>
+          <w:tcPr>
+            <w:tcW w:type="dxa" w:w="1872"/>
+            <w:shd w:fill="FFFFFF"/>
+            <w:tcMar>
+              <w:top w:w="120" w:type="dxa"/>
+              <w:bottom w:w="120" w:type="dxa"/>
+              <w:left w:w="160" w:type="dxa"/>
+              <w:right w:w="160" w:type="dxa"/>
+            </w:tcMar>
+            <w:vAlign w:val="center"/>
+          </w:tcPr>
+          <w:p>
+            <w:pPr>
+              <w:spacing w:before="20" w:after="20" w:line="276" w:lineRule="auto"/>
+            </w:pPr>
+            <w:r>
+              <w:rPr>
+                <w:rFonts w:ascii="Consolas" w:hAnsi="Consolas"/>
+                <w:color w:val="B42828"/>
+                <w:sz w:val="19"/>
+              </w:rPr>
+              <w:t>GET</w:t>
+            </w:r>
+          </w:p>
+        </w:tc>
+        <w:tc>
+          <w:tcPr>
+            <w:tcW w:type="dxa" w:w="1872"/>
+            <w:shd w:fill="FFFFFF"/>
+            <w:tcMar>
+              <w:top w:w="120" w:type="dxa"/>
+              <w:bottom w:w="120" w:type="dxa"/>
+              <w:left w:w="160" w:type="dxa"/>
+              <w:right w:w="160" w:type="dxa"/>
+            </w:tcMar>
+            <w:vAlign w:val="center"/>
+          </w:tcPr>
+          <w:p>
+            <w:pPr>
+              <w:spacing w:before="20" w:after="20" w:line="276" w:lineRule="auto"/>
+            </w:pPr>
+            <w:r>
+              <w:rPr>
+                <w:rFonts w:ascii="Consolas" w:hAnsi="Consolas"/>
+                <w:color w:val="B42828"/>
+                <w:sz w:val="19"/>
+              </w:rPr>
+              <w:t>/</w:t>
+            </w:r>
+          </w:p>
+        </w:tc>
+        <w:tc>
+          <w:tcPr>
+            <w:tcW w:type="dxa" w:w="1872"/>
+            <w:shd w:fill="FFFFFF"/>
+            <w:tcMar>
+              <w:top w:w="120" w:type="dxa"/>
+              <w:bottom w:w="120" w:type="dxa"/>
+              <w:left w:w="160" w:type="dxa"/>
+              <w:right w:w="160" w:type="dxa"/>
+            </w:tcMar>
+            <w:vAlign w:val="center"/>
+          </w:tcPr>
+          <w:p>
+            <w:pPr>
+              <w:spacing w:before="20" w:after="20" w:line="276" w:lineRule="auto"/>
+            </w:pPr>
+            <w:r>
+              <w:rPr>
+                <w:rFonts w:ascii="Segoe UI" w:hAnsi="Segoe UI"/>
+                <w:sz w:val="19"/>
+              </w:rPr>
+              <w:t>Public</w:t>
+            </w:r>
+          </w:p>
+        </w:tc>
+        <w:tc>
+          <w:tcPr>
+            <w:tcW w:type="dxa" w:w="1872"/>
+            <w:shd w:fill="FFFFFF"/>
+            <w:tcMar>
+              <w:top w:w="120" w:type="dxa"/>
+              <w:bottom w:w="120" w:type="dxa"/>
+              <w:left w:w="160" w:type="dxa"/>
+              <w:right w:w="160" w:type="dxa"/>
+            </w:tcMar>
+            <w:vAlign w:val="center"/>
+          </w:tcPr>
+          <w:p>
+            <w:pPr>
+              <w:spacing w:before="20" w:after="20" w:line="276" w:lineRule="auto"/>
+            </w:pPr>
+            <w:r>
+              <w:rPr>
+                <w:rFonts w:ascii="Segoe UI" w:hAnsi="Segoe UI"/>
+                <w:sz w:val="19"/>
+              </w:rPr>
+              <w:t>Kiểm tra trạng thái máy chủ, phiên bản, link Swagger UI &amp; H2 Console</w:t>
+            </w:r>
+          </w:p>
+        </w:tc>
+      </w:tr>
+      <w:tr>
+        <w:tc>
+          <w:tcPr>
+            <w:tcW w:type="dxa" w:w="1872"/>
+            <w:shd w:fill="F8FAFC"/>
+            <w:tcMar>
+              <w:top w:w="120" w:type="dxa"/>
+              <w:bottom w:w="120" w:type="dxa"/>
+              <w:left w:w="160" w:type="dxa"/>
+              <w:right w:w="160" w:type="dxa"/>
+            </w:tcMar>
+            <w:vAlign w:val="center"/>
+          </w:tcPr>
+          <w:p>
+            <w:pPr>
+              <w:spacing w:before="20" w:after="20" w:line="276" w:lineRule="auto"/>
+            </w:pPr>
+          </w:p>
+        </w:tc>
+        <w:tc>
+          <w:tcPr>
+            <w:tcW w:type="dxa" w:w="1872"/>
+            <w:shd w:fill="F8FAFC"/>
+            <w:tcMar>
+              <w:top w:w="120" w:type="dxa"/>
+              <w:bottom w:w="120" w:type="dxa"/>
+              <w:left w:w="160" w:type="dxa"/>
+              <w:right w:w="160" w:type="dxa"/>
+            </w:tcMar>
+            <w:vAlign w:val="center"/>
+          </w:tcPr>
+          <w:p>
+            <w:pPr>
+              <w:spacing w:before="20" w:after="20" w:line="276" w:lineRule="auto"/>
+            </w:pPr>
+            <w:r>
+              <w:rPr>
+                <w:rFonts w:ascii="Consolas" w:hAnsi="Consolas"/>
+                <w:color w:val="B42828"/>
+                <w:sz w:val="19"/>
+              </w:rPr>
+              <w:t>GET</w:t>
+            </w:r>
+          </w:p>
+        </w:tc>
+        <w:tc>
+          <w:tcPr>
+            <w:tcW w:type="dxa" w:w="1872"/>
+            <w:shd w:fill="F8FAFC"/>
+            <w:tcMar>
+              <w:top w:w="120" w:type="dxa"/>
+              <w:bottom w:w="120" w:type="dxa"/>
+              <w:left w:w="160" w:type="dxa"/>
+              <w:right w:w="160" w:type="dxa"/>
+            </w:tcMar>
+            <w:vAlign w:val="center"/>
+          </w:tcPr>
+          <w:p>
+            <w:pPr>
+              <w:spacing w:before="20" w:after="20" w:line="276" w:lineRule="auto"/>
+            </w:pPr>
+            <w:r>
+              <w:rPr>
+                <w:rFonts w:ascii="Consolas" w:hAnsi="Consolas"/>
+                <w:color w:val="B42828"/>
+                <w:sz w:val="19"/>
+              </w:rPr>
+              <w:t>/h2-console</w:t>
+            </w:r>
+          </w:p>
+        </w:tc>
+        <w:tc>
+          <w:tcPr>
+            <w:tcW w:type="dxa" w:w="1872"/>
+            <w:shd w:fill="F8FAFC"/>
+            <w:tcMar>
+              <w:top w:w="120" w:type="dxa"/>
+              <w:bottom w:w="120" w:type="dxa"/>
+              <w:left w:w="160" w:type="dxa"/>
+              <w:right w:w="160" w:type="dxa"/>
+            </w:tcMar>
+            <w:vAlign w:val="center"/>
+          </w:tcPr>
+          <w:p>
+            <w:pPr>
+              <w:spacing w:before="20" w:after="20" w:line="276" w:lineRule="auto"/>
+            </w:pPr>
+            <w:r>
+              <w:rPr>
+                <w:rFonts w:ascii="Segoe UI" w:hAnsi="Segoe UI"/>
+                <w:sz w:val="19"/>
+              </w:rPr>
+              <w:t>Public / Dev</w:t>
+            </w:r>
+          </w:p>
+        </w:tc>
+        <w:tc>
+          <w:tcPr>
+            <w:tcW w:type="dxa" w:w="1872"/>
+            <w:shd w:fill="F8FAFC"/>
+            <w:tcMar>
+              <w:top w:w="120" w:type="dxa"/>
+              <w:bottom w:w="120" w:type="dxa"/>
+              <w:left w:w="160" w:type="dxa"/>
+              <w:right w:w="160" w:type="dxa"/>
+            </w:tcMar>
+            <w:vAlign w:val="center"/>
+          </w:tcPr>
+          <w:p>
+            <w:pPr>
+              <w:spacing w:before="20" w:after="20" w:line="276" w:lineRule="auto"/>
+            </w:pPr>
+            <w:r>
+              <w:rPr>
+                <w:rFonts w:ascii="Segoe UI" w:hAnsi="Segoe UI"/>
+                <w:sz w:val="19"/>
+              </w:rPr>
+              <w:t xml:space="preserve">Giao diện điều khiển CSDL H2 In-Memory (JDBC URL: </w:t>
+            </w:r>
+            <w:r>
+              <w:rPr>
+                <w:rFonts w:ascii="Consolas" w:hAnsi="Consolas"/>
+                <w:color w:val="B42828"/>
+                <w:sz w:val="19"/>
+              </w:rPr>
+              <w:t>jdbc:h2:mem:freelance_db</w:t>
+            </w:r>
+            <w:r>
+              <w:rPr>
+                <w:rFonts w:ascii="Segoe UI" w:hAnsi="Segoe UI"/>
+                <w:sz w:val="19"/>
+              </w:rPr>
+              <w:t>)</w:t>
             </w:r>
           </w:p>
         </w:tc>
@@ -2904,11 +3169,31 @@
             <w:pPr>
               <w:spacing w:before="20" w:after="20" w:line="276" w:lineRule="auto"/>
             </w:pPr>
+          </w:p>
+        </w:tc>
+        <w:tc>
+          <w:tcPr>
+            <w:tcW w:type="dxa" w:w="1872"/>
+            <w:shd w:fill="F8FAFC"/>
+            <w:tcMar>
+              <w:top w:w="120" w:type="dxa"/>
+              <w:bottom w:w="120" w:type="dxa"/>
+              <w:left w:w="160" w:type="dxa"/>
+              <w:right w:w="160" w:type="dxa"/>
+            </w:tcMar>
+            <w:vAlign w:val="center"/>
+          </w:tcPr>
+          <w:p>
+            <w:pPr>
+              <w:spacing w:before="20" w:after="20" w:line="276" w:lineRule="auto"/>
+            </w:pPr>
             <w:r>
               <w:rPr>
-                <w:b/>
+                <w:rFonts w:ascii="Consolas" w:hAnsi="Consolas"/>
+                <w:color w:val="B42828"/>
+                <w:sz w:val="19"/>
               </w:rPr>
-              <w:t>Reviews</w:t>
+              <w:t>PATCH</w:t>
             </w:r>
           </w:p>
         </w:tc>
@@ -2934,7 +3219,7 @@
                 <w:color w:val="B42828"/>
                 <w:sz w:val="19"/>
               </w:rPr>
-              <w:t>POST</w:t>
+              <w:t>/applications/{id}/cancel</w:t>
             </w:r>
           </w:p>
         </w:tc>
@@ -2960,7 +3245,7 @@
                 <w:color w:val="B42828"/>
                 <w:sz w:val="19"/>
               </w:rPr>
-              <w:t>/reviews</w:t>
+              <w:t>ROLE_STUDENT</w:t>
             </w:r>
           </w:p>
         </w:tc>
@@ -2985,7 +3270,215 @@
                 <w:rFonts w:ascii="Segoe UI" w:hAnsi="Segoe UI"/>
                 <w:sz w:val="19"/>
               </w:rPr>
+              <w:t xml:space="preserve">Sinh viên tự hủy đơn nộp khi còn ở trạng thái </w:t>
+            </w:r>
+            <w:r>
+              <w:rPr>
+                <w:rFonts w:ascii="Consolas" w:hAnsi="Consolas"/>
+                <w:color w:val="B42828"/>
+                <w:sz w:val="19"/>
+              </w:rPr>
+              <w:t>PENDING</w:t>
+            </w:r>
+          </w:p>
+        </w:tc>
+      </w:tr>
+      <w:tr>
+        <w:tc>
+          <w:tcPr>
+            <w:tcW w:type="dxa" w:w="1872"/>
+            <w:shd w:fill="FFFFFF"/>
+            <w:tcMar>
+              <w:top w:w="120" w:type="dxa"/>
+              <w:bottom w:w="120" w:type="dxa"/>
+              <w:left w:w="160" w:type="dxa"/>
+              <w:right w:w="160" w:type="dxa"/>
+            </w:tcMar>
+            <w:vAlign w:val="center"/>
+          </w:tcPr>
+          <w:p>
+            <w:pPr>
+              <w:spacing w:before="20" w:after="20" w:line="276" w:lineRule="auto"/>
+            </w:pPr>
+            <w:r>
+              <w:rPr>
+                <w:b/>
+              </w:rPr>
+              <w:t>Reviews</w:t>
+            </w:r>
+          </w:p>
+        </w:tc>
+        <w:tc>
+          <w:tcPr>
+            <w:tcW w:type="dxa" w:w="1872"/>
+            <w:shd w:fill="FFFFFF"/>
+            <w:tcMar>
+              <w:top w:w="120" w:type="dxa"/>
+              <w:bottom w:w="120" w:type="dxa"/>
+              <w:left w:w="160" w:type="dxa"/>
+              <w:right w:w="160" w:type="dxa"/>
+            </w:tcMar>
+            <w:vAlign w:val="center"/>
+          </w:tcPr>
+          <w:p>
+            <w:pPr>
+              <w:spacing w:before="20" w:after="20" w:line="276" w:lineRule="auto"/>
+            </w:pPr>
+            <w:r>
+              <w:rPr>
+                <w:rFonts w:ascii="Consolas" w:hAnsi="Consolas"/>
+                <w:color w:val="B42828"/>
+                <w:sz w:val="19"/>
+              </w:rPr>
+              <w:t>POST</w:t>
+            </w:r>
+          </w:p>
+        </w:tc>
+        <w:tc>
+          <w:tcPr>
+            <w:tcW w:type="dxa" w:w="1872"/>
+            <w:shd w:fill="FFFFFF"/>
+            <w:tcMar>
+              <w:top w:w="120" w:type="dxa"/>
+              <w:bottom w:w="120" w:type="dxa"/>
+              <w:left w:w="160" w:type="dxa"/>
+              <w:right w:w="160" w:type="dxa"/>
+            </w:tcMar>
+            <w:vAlign w:val="center"/>
+          </w:tcPr>
+          <w:p>
+            <w:pPr>
+              <w:spacing w:before="20" w:after="20" w:line="276" w:lineRule="auto"/>
+            </w:pPr>
+            <w:r>
+              <w:rPr>
+                <w:rFonts w:ascii="Consolas" w:hAnsi="Consolas"/>
+                <w:color w:val="B42828"/>
+                <w:sz w:val="19"/>
+              </w:rPr>
+              <w:t>/reviews</w:t>
+            </w:r>
+          </w:p>
+        </w:tc>
+        <w:tc>
+          <w:tcPr>
+            <w:tcW w:type="dxa" w:w="1872"/>
+            <w:shd w:fill="FFFFFF"/>
+            <w:tcMar>
+              <w:top w:w="120" w:type="dxa"/>
+              <w:bottom w:w="120" w:type="dxa"/>
+              <w:left w:w="160" w:type="dxa"/>
+              <w:right w:w="160" w:type="dxa"/>
+            </w:tcMar>
+            <w:vAlign w:val="center"/>
+          </w:tcPr>
+          <w:p>
+            <w:pPr>
+              <w:spacing w:before="20" w:after="20" w:line="276" w:lineRule="auto"/>
+            </w:pPr>
+            <w:r>
+              <w:rPr>
+                <w:rFonts w:ascii="Segoe UI" w:hAnsi="Segoe UI"/>
+                <w:sz w:val="19"/>
+              </w:rPr>
               <w:t>Authenticated</w:t>
+            </w:r>
+          </w:p>
+        </w:tc>
+        <w:tc>
+          <w:tcPr>
+            <w:tcW w:type="dxa" w:w="1872"/>
+            <w:shd w:fill="FFFFFF"/>
+            <w:tcMar>
+              <w:top w:w="120" w:type="dxa"/>
+              <w:bottom w:w="120" w:type="dxa"/>
+              <w:left w:w="160" w:type="dxa"/>
+              <w:right w:w="160" w:type="dxa"/>
+            </w:tcMar>
+            <w:vAlign w:val="center"/>
+          </w:tcPr>
+          <w:p>
+            <w:pPr>
+              <w:spacing w:before="20" w:after="20" w:line="276" w:lineRule="auto"/>
+            </w:pPr>
+            <w:r>
+              <w:rPr>
+                <w:rFonts w:ascii="Segoe UI" w:hAnsi="Segoe UI"/>
+                <w:sz w:val="19"/>
+              </w:rPr>
+              <w:t>Gửi đánh giá hai chiều (1–5 sao kèm nhận xét)</w:t>
+            </w:r>
+          </w:p>
+        </w:tc>
+      </w:tr>
+      <w:tr>
+        <w:tc>
+          <w:tcPr>
+            <w:tcW w:type="dxa" w:w="1872"/>
+            <w:shd w:fill="F8FAFC"/>
+            <w:tcMar>
+              <w:top w:w="120" w:type="dxa"/>
+              <w:bottom w:w="120" w:type="dxa"/>
+              <w:left w:w="160" w:type="dxa"/>
+              <w:right w:w="160" w:type="dxa"/>
+            </w:tcMar>
+            <w:vAlign w:val="center"/>
+          </w:tcPr>
+          <w:p>
+            <w:pPr>
+              <w:spacing w:before="20" w:after="20" w:line="276" w:lineRule="auto"/>
+            </w:pPr>
+          </w:p>
+        </w:tc>
+        <w:tc>
+          <w:tcPr>
+            <w:tcW w:type="dxa" w:w="1872"/>
+            <w:shd w:fill="F8FAFC"/>
+            <w:tcMar>
+              <w:top w:w="120" w:type="dxa"/>
+              <w:bottom w:w="120" w:type="dxa"/>
+              <w:left w:w="160" w:type="dxa"/>
+              <w:right w:w="160" w:type="dxa"/>
+            </w:tcMar>
+            <w:vAlign w:val="center"/>
+          </w:tcPr>
+          <w:p>
+            <w:pPr>
+              <w:spacing w:before="20" w:after="20" w:line="276" w:lineRule="auto"/>
+            </w:pPr>
+            <w:r>
+              <w:rPr>
+                <w:rFonts w:ascii="Consolas" w:hAnsi="Consolas"/>
+                <w:color w:val="B42828"/>
+                <w:sz w:val="19"/>
+              </w:rPr>
+              <w:t>GET</w:t>
+            </w:r>
+          </w:p>
+        </w:tc>
+        <w:tc>
+          <w:tcPr>
+            <w:tcW w:type="dxa" w:w="1872"/>
+            <w:shd w:fill="F8FAFC"/>
+            <w:tcMar>
+              <w:top w:w="120" w:type="dxa"/>
+              <w:bottom w:w="120" w:type="dxa"/>
+              <w:left w:w="160" w:type="dxa"/>
+              <w:right w:w="160" w:type="dxa"/>
+            </w:tcMar>
+            <w:vAlign w:val="center"/>
+          </w:tcPr>
+          <w:p>
+            <w:pPr>
+              <w:spacing w:before="20" w:after="20" w:line="276" w:lineRule="auto"/>
+            </w:pPr>
+            <w:r>
+              <w:rPr>
+                <w:rFonts w:ascii="Consolas" w:hAnsi="Consolas"/>
+                <w:color w:val="B42828"/>
+                <w:sz w:val="19"/>
+              </w:rPr>
+              <w:t>/reviews/job/{jobId}</w:t>
             </w:r>
           </w:p>
         </w:tc>
@@ -3010,7 +3503,32 @@
                 <w:rFonts w:ascii="Segoe UI" w:hAnsi="Segoe UI"/>
                 <w:sz w:val="19"/>
               </w:rPr>
-              <w:t>Gửi đánh giá hai chiều (1–5 sao kèm nhận xét)</w:t>
+              <w:t>Public</w:t>
+            </w:r>
+          </w:p>
+        </w:tc>
+        <w:tc>
+          <w:tcPr>
+            <w:tcW w:type="dxa" w:w="1872"/>
+            <w:shd w:fill="F8FAFC"/>
+            <w:tcMar>
+              <w:top w:w="120" w:type="dxa"/>
+              <w:bottom w:w="120" w:type="dxa"/>
+              <w:left w:w="160" w:type="dxa"/>
+              <w:right w:w="160" w:type="dxa"/>
+            </w:tcMar>
+            <w:vAlign w:val="center"/>
+          </w:tcPr>
+          <w:p>
+            <w:pPr>
+              <w:spacing w:before="20" w:after="20" w:line="276" w:lineRule="auto"/>
+            </w:pPr>
+            <w:r>
+              <w:rPr>
+                <w:rFonts w:ascii="Segoe UI" w:hAnsi="Segoe UI"/>
+                <w:sz w:val="19"/>
+              </w:rPr>
+              <w:t>Lấy tất cả đánh giá của một công việc</w:t>
             </w:r>
           </w:p>
         </w:tc>
@@ -3082,7 +3600,7 @@
                 <w:color w:val="B42828"/>
                 <w:sz w:val="19"/>
               </w:rPr>
-              <w:t>/reviews/job/{jobId}</w:t>
+              <w:t>/reviews/user/{userId}</w:t>
             </w:r>
           </w:p>
         </w:tc>
@@ -3132,7 +3650,7 @@
                 <w:rFonts w:ascii="Segoe UI" w:hAnsi="Segoe UI"/>
                 <w:sz w:val="19"/>
               </w:rPr>
-              <w:t>Lấy tất cả đánh giá của một công việc</w:t>
+              <w:t>Lấy tất cả đánh giá nhận được của một người dùng</w:t>
             </w:r>
           </w:p>
         </w:tc>
@@ -3154,6 +3672,12 @@
             <w:pPr>
               <w:spacing w:before="20" w:after="20" w:line="276" w:lineRule="auto"/>
             </w:pPr>
+            <w:r>
+              <w:rPr>
+                <w:b/>
+              </w:rPr>
+              <w:t>Users</w:t>
+            </w:r>
           </w:p>
         </w:tc>
         <w:tc>
@@ -3204,7 +3728,7 @@
                 <w:color w:val="B42828"/>
                 <w:sz w:val="19"/>
               </w:rPr>
-              <w:t>/reviews/user/{userId}</w:t>
+              <w:t>/users/{id}</w:t>
             </w:r>
           </w:p>
         </w:tc>
@@ -3254,7 +3778,7 @@
                 <w:rFonts w:ascii="Segoe UI" w:hAnsi="Segoe UI"/>
                 <w:sz w:val="19"/>
               </w:rPr>
-              <w:t>Lấy tất cả đánh giá nhận được của một người dùng</w:t>
+              <w:t>Xem hồ sơ công khai của người dùng theo ID</w:t>
             </w:r>
           </w:p>
         </w:tc>
@@ -3276,11 +3800,31 @@
             <w:pPr>
               <w:spacing w:before="20" w:after="20" w:line="276" w:lineRule="auto"/>
             </w:pPr>
+          </w:p>
+        </w:tc>
+        <w:tc>
+          <w:tcPr>
+            <w:tcW w:type="dxa" w:w="1872"/>
+            <w:shd w:fill="FFFFFF"/>
+            <w:tcMar>
+              <w:top w:w="120" w:type="dxa"/>
+              <w:bottom w:w="120" w:type="dxa"/>
+              <w:left w:w="160" w:type="dxa"/>
+              <w:right w:w="160" w:type="dxa"/>
+            </w:tcMar>
+            <w:vAlign w:val="center"/>
+          </w:tcPr>
+          <w:p>
+            <w:pPr>
+              <w:spacing w:before="20" w:after="20" w:line="276" w:lineRule="auto"/>
+            </w:pPr>
             <w:r>
               <w:rPr>
-                <w:b/>
+                <w:rFonts w:ascii="Consolas" w:hAnsi="Consolas"/>
+                <w:color w:val="B42828"/>
+                <w:sz w:val="19"/>
               </w:rPr>
-              <w:t>Users</w:t>
+              <w:t>PUT</w:t>
             </w:r>
           </w:p>
         </w:tc>
@@ -3306,33 +3850,7 @@
                 <w:color w:val="B42828"/>
                 <w:sz w:val="19"/>
               </w:rPr>
-              <w:t>GET</w:t>
-            </w:r>
-          </w:p>
-        </w:tc>
-        <w:tc>
-          <w:tcPr>
-            <w:tcW w:type="dxa" w:w="1872"/>
-            <w:shd w:fill="FFFFFF"/>
-            <w:tcMar>
-              <w:top w:w="120" w:type="dxa"/>
-              <w:bottom w:w="120" w:type="dxa"/>
-              <w:left w:w="160" w:type="dxa"/>
-              <w:right w:w="160" w:type="dxa"/>
-            </w:tcMar>
-            <w:vAlign w:val="center"/>
-          </w:tcPr>
-          <w:p>
-            <w:pPr>
-              <w:spacing w:before="20" w:after="20" w:line="276" w:lineRule="auto"/>
-            </w:pPr>
-            <w:r>
-              <w:rPr>
-                <w:rFonts w:ascii="Consolas" w:hAnsi="Consolas"/>
-                <w:color w:val="B42828"/>
-                <w:sz w:val="19"/>
-              </w:rPr>
-              <w:t>/users/{id}</w:t>
+              <w:t>/users/profile</w:t>
             </w:r>
           </w:p>
         </w:tc>
@@ -3357,7 +3875,7 @@
                 <w:rFonts w:ascii="Segoe UI" w:hAnsi="Segoe UI"/>
                 <w:sz w:val="19"/>
               </w:rPr>
-              <w:t>Public</w:t>
+              <w:t>Authenticated</w:t>
             </w:r>
           </w:p>
         </w:tc>
@@ -3382,7 +3900,7 @@
                 <w:rFonts w:ascii="Segoe UI" w:hAnsi="Segoe UI"/>
                 <w:sz w:val="19"/>
               </w:rPr>
-              <w:t>Xem hồ sơ công khai của người dùng theo ID</w:t>
+              <w:t>Cập nhật hồ sơ cá nhân đa vai trò (Sinh viên, NTD, Admin)</w:t>
             </w:r>
           </w:p>
         </w:tc>
@@ -3454,7 +3972,33 @@
                 <w:color w:val="B42828"/>
                 <w:sz w:val="19"/>
               </w:rPr>
-              <w:t>/users/profile</w:t>
+              <w:t>/students/me</w:t>
+            </w:r>
+          </w:p>
+        </w:tc>
+        <w:tc>
+          <w:tcPr>
+            <w:tcW w:type="dxa" w:w="1872"/>
+            <w:shd w:fill="F8FAFC"/>
+            <w:tcMar>
+              <w:top w:w="120" w:type="dxa"/>
+              <w:bottom w:w="120" w:type="dxa"/>
+              <w:left w:w="160" w:type="dxa"/>
+              <w:right w:w="160" w:type="dxa"/>
+            </w:tcMar>
+            <w:vAlign w:val="center"/>
+          </w:tcPr>
+          <w:p>
+            <w:pPr>
+              <w:spacing w:before="20" w:after="20" w:line="276" w:lineRule="auto"/>
+            </w:pPr>
+            <w:r>
+              <w:rPr>
+                <w:rFonts w:ascii="Consolas" w:hAnsi="Consolas"/>
+                <w:color w:val="B42828"/>
+                <w:sz w:val="19"/>
+              </w:rPr>
+              <w:t>ROLE_STUDENT</w:t>
             </w:r>
           </w:p>
         </w:tc>
@@ -3479,32 +4023,7 @@
                 <w:rFonts w:ascii="Segoe UI" w:hAnsi="Segoe UI"/>
                 <w:sz w:val="19"/>
               </w:rPr>
-              <w:t>Authenticated</w:t>
-            </w:r>
-          </w:p>
-        </w:tc>
-        <w:tc>
-          <w:tcPr>
-            <w:tcW w:type="dxa" w:w="1872"/>
-            <w:shd w:fill="F8FAFC"/>
-            <w:tcMar>
-              <w:top w:w="120" w:type="dxa"/>
-              <w:bottom w:w="120" w:type="dxa"/>
-              <w:left w:w="160" w:type="dxa"/>
-              <w:right w:w="160" w:type="dxa"/>
-            </w:tcMar>
-            <w:vAlign w:val="center"/>
-          </w:tcPr>
-          <w:p>
-            <w:pPr>
-              <w:spacing w:before="20" w:after="20" w:line="276" w:lineRule="auto"/>
-            </w:pPr>
-            <w:r>
-              <w:rPr>
-                <w:rFonts w:ascii="Segoe UI" w:hAnsi="Segoe UI"/>
-                <w:sz w:val="19"/>
-              </w:rPr>
-              <w:t>Cập nhật hồ sơ cá nhân của tài khoản hiện tại</w:t>
+              <w:t>Cập nhật hồ sơ học vấn, kỹ năng và CV cho sinh viên</w:t>
             </w:r>
           </w:p>
         </w:tc>
@@ -5058,6 +5577,312 @@
         <w:t>}</w:t>
       </w:r>
     </w:p>
+    <w:p>
+      <w:pPr>
+        <w:pStyle w:val="Heading3"/>
+        <w:spacing w:before="200" w:after="80"/>
+      </w:pPr>
+      <w:r>
+        <w:rPr>
+          <w:rFonts w:ascii="Segoe UI" w:hAnsi="Segoe UI"/>
+          <w:b/>
+          <w:color w:val="0F172A"/>
+          <w:sz w:val="24"/>
+        </w:rPr>
+        <w:t>3.8. Kiểm tra trạng thái máy chủ (`GET /api/v1/`)</w:t>
+      </w:r>
+    </w:p>
+    <w:p>
+      <w:pPr>
+        <w:pStyle w:val="ListBullet"/>
+        <w:spacing w:before="40" w:after="40" w:line="276" w:lineRule="auto"/>
+      </w:pPr>
+      <w:r>
+        <w:rPr>
+          <w:b/>
+        </w:rPr>
+        <w:t>Headers:</w:t>
+      </w:r>
+      <w:r>
+        <w:rPr>
+          <w:rFonts w:ascii="Segoe UI" w:hAnsi="Segoe UI"/>
+          <w:sz w:val="20"/>
+        </w:rPr>
+        <w:t xml:space="preserve"> Không yêu cầu (Public)</w:t>
+      </w:r>
+    </w:p>
+    <w:p>
+      <w:pPr>
+        <w:pStyle w:val="ListBullet"/>
+        <w:spacing w:before="40" w:after="40" w:line="276" w:lineRule="auto"/>
+      </w:pPr>
+      <w:r>
+        <w:rPr>
+          <w:b/>
+        </w:rPr>
+        <w:t>Response (200 OK):</w:t>
+      </w:r>
+    </w:p>
+    <w:p>
+      <w:pPr>
+        <w:spacing w:before="80" w:after="160"/>
+        <w:ind w:left="360" w:right="360"/>
+        <w:pBdr>
+          <w:left w:val="single" w:sz="24" w:space="8" w:color="4F46E5"/>
+        </w:pBdr>
+        <w:shd w:fill="F8FAFC"/>
+      </w:pPr>
+      <w:r>
+        <w:rPr>
+          <w:rFonts w:ascii="Consolas" w:hAnsi="Consolas"/>
+          <w:color w:val="1E293B"/>
+          <w:sz w:val="18"/>
+        </w:rPr>
+        <w:t>{</w:t>
+        <w:br/>
+        <w:t xml:space="preserve">  "name": "Freelance Student Marketplace API",</w:t>
+        <w:br/>
+        <w:t xml:space="preserve">  "version": "1.0.0",</w:t>
+        <w:br/>
+        <w:t xml:space="preserve">  "status": "UP",</w:t>
+        <w:br/>
+        <w:t xml:space="preserve">  "docs": "/api/v1/swagger-ui.html",</w:t>
+        <w:br/>
+        <w:t xml:space="preserve">  "h2Console": "/api/v1/h2-console",</w:t>
+        <w:br/>
+        <w:t xml:space="preserve">  "timestamp": 1728578400000</w:t>
+        <w:br/>
+        <w:t>}</w:t>
+      </w:r>
+    </w:p>
+    <w:p>
+      <w:pPr>
+        <w:pStyle w:val="Heading3"/>
+        <w:spacing w:before="200" w:after="80"/>
+      </w:pPr>
+      <w:r>
+        <w:rPr>
+          <w:rFonts w:ascii="Segoe UI" w:hAnsi="Segoe UI"/>
+          <w:b/>
+          <w:color w:val="0F172A"/>
+          <w:sz w:val="24"/>
+        </w:rPr>
+        <w:t>3.9. Hủy đơn ứng tuyển bởi sinh viên (`PATCH /api/v1/applications/{id}/cancel`)</w:t>
+      </w:r>
+    </w:p>
+    <w:p>
+      <w:pPr>
+        <w:pStyle w:val="ListBullet"/>
+        <w:spacing w:before="40" w:after="40" w:line="276" w:lineRule="auto"/>
+      </w:pPr>
+      <w:r>
+        <w:rPr>
+          <w:b/>
+        </w:rPr>
+        <w:t>Headers:</w:t>
+      </w:r>
+      <w:r>
+        <w:rPr>
+          <w:rFonts w:ascii="Segoe UI" w:hAnsi="Segoe UI"/>
+          <w:sz w:val="20"/>
+        </w:rPr>
+        <w:t xml:space="preserve"> </w:t>
+      </w:r>
+      <w:r>
+        <w:rPr>
+          <w:rFonts w:ascii="Consolas" w:hAnsi="Consolas"/>
+          <w:color w:val="B42828"/>
+          <w:sz w:val="19"/>
+        </w:rPr>
+        <w:t>Authorization: Bearer &lt;student_token&gt;</w:t>
+      </w:r>
+    </w:p>
+    <w:p>
+      <w:pPr>
+        <w:pStyle w:val="ListBullet"/>
+        <w:spacing w:before="40" w:after="40" w:line="276" w:lineRule="auto"/>
+      </w:pPr>
+      <w:r>
+        <w:rPr>
+          <w:b/>
+        </w:rPr>
+        <w:t>Response (200 OK):</w:t>
+      </w:r>
+    </w:p>
+    <w:p>
+      <w:pPr>
+        <w:spacing w:before="80" w:after="160"/>
+        <w:ind w:left="360" w:right="360"/>
+        <w:pBdr>
+          <w:left w:val="single" w:sz="24" w:space="8" w:color="4F46E5"/>
+        </w:pBdr>
+        <w:shd w:fill="F8FAFC"/>
+      </w:pPr>
+      <w:r>
+        <w:rPr>
+          <w:rFonts w:ascii="Consolas" w:hAnsi="Consolas"/>
+          <w:color w:val="1E293B"/>
+          <w:sz w:val="18"/>
+        </w:rPr>
+        <w:t>{</w:t>
+        <w:br/>
+        <w:t xml:space="preserve">  "success": true,</w:t>
+        <w:br/>
+        <w:t xml:space="preserve">  "message": "Đã hủy đơn ứng tuyển thành công",</w:t>
+        <w:br/>
+        <w:t xml:space="preserve">  "data": {</w:t>
+        <w:br/>
+        <w:t xml:space="preserve">    "id": 15,</w:t>
+        <w:br/>
+        <w:t xml:space="preserve">    "jobId": 1455,</w:t>
+        <w:br/>
+        <w:t xml:space="preserve">    "studentId": 4,</w:t>
+        <w:br/>
+        <w:t xml:space="preserve">    "status": "CANCELLED",</w:t>
+        <w:br/>
+        <w:t xml:space="preserve">    "appliedAt": "2026-10-10T14:30:00"</w:t>
+        <w:br/>
+        <w:t xml:space="preserve">  }</w:t>
+        <w:br/>
+        <w:t>}</w:t>
+      </w:r>
+    </w:p>
+    <w:p>
+      <w:pPr>
+        <w:pStyle w:val="Heading3"/>
+        <w:spacing w:before="200" w:after="80"/>
+      </w:pPr>
+      <w:r>
+        <w:rPr>
+          <w:rFonts w:ascii="Segoe UI" w:hAnsi="Segoe UI"/>
+          <w:b/>
+          <w:color w:val="0F172A"/>
+          <w:sz w:val="24"/>
+        </w:rPr>
+        <w:t>3.10. Cập nhật hồ sơ người dùng (`PUT /api/v1/users/profile`)</w:t>
+      </w:r>
+    </w:p>
+    <w:p>
+      <w:pPr>
+        <w:pStyle w:val="ListBullet"/>
+        <w:spacing w:before="40" w:after="40" w:line="276" w:lineRule="auto"/>
+      </w:pPr>
+      <w:r>
+        <w:rPr>
+          <w:b/>
+        </w:rPr>
+        <w:t>Headers:</w:t>
+      </w:r>
+      <w:r>
+        <w:rPr>
+          <w:rFonts w:ascii="Segoe UI" w:hAnsi="Segoe UI"/>
+          <w:sz w:val="20"/>
+        </w:rPr>
+        <w:t xml:space="preserve"> </w:t>
+      </w:r>
+      <w:r>
+        <w:rPr>
+          <w:rFonts w:ascii="Consolas" w:hAnsi="Consolas"/>
+          <w:color w:val="B42828"/>
+          <w:sz w:val="19"/>
+        </w:rPr>
+        <w:t>Authorization: Bearer &lt;token&gt;</w:t>
+      </w:r>
+    </w:p>
+    <w:p>
+      <w:pPr>
+        <w:pStyle w:val="ListBullet"/>
+        <w:spacing w:before="40" w:after="40" w:line="276" w:lineRule="auto"/>
+      </w:pPr>
+      <w:r>
+        <w:rPr>
+          <w:b/>
+        </w:rPr>
+        <w:t>Request Body (Sinh viên / NTD / Admin):</w:t>
+      </w:r>
+    </w:p>
+    <w:p>
+      <w:pPr>
+        <w:spacing w:before="80" w:after="160"/>
+        <w:ind w:left="360" w:right="360"/>
+        <w:pBdr>
+          <w:left w:val="single" w:sz="24" w:space="8" w:color="4F46E5"/>
+        </w:pBdr>
+        <w:shd w:fill="F8FAFC"/>
+      </w:pPr>
+      <w:r>
+        <w:rPr>
+          <w:rFonts w:ascii="Consolas" w:hAnsi="Consolas"/>
+          <w:color w:val="1E293B"/>
+          <w:sz w:val="18"/>
+        </w:rPr>
+        <w:t>{</w:t>
+        <w:br/>
+        <w:t xml:space="preserve">  "fullName": "Nguyễn Bá Anh Khôi",</w:t>
+        <w:br/>
+        <w:t xml:space="preserve">  "phone": "0912345678",</w:t>
+        <w:br/>
+        <w:t xml:space="preserve">  "bio": "Sinh viên năm cuối ngành CNTT, đam mê React &amp; Spring Boot",</w:t>
+        <w:br/>
+        <w:t xml:space="preserve">  "companyName": null,</w:t>
+        <w:br/>
+        <w:t xml:space="preserve">  "companyAddress": null</w:t>
+        <w:br/>
+        <w:t>}</w:t>
+      </w:r>
+    </w:p>
+    <w:p>
+      <w:pPr>
+        <w:pStyle w:val="ListBullet"/>
+        <w:spacing w:before="40" w:after="40" w:line="276" w:lineRule="auto"/>
+      </w:pPr>
+      <w:r>
+        <w:rPr>
+          <w:b/>
+        </w:rPr>
+        <w:t>Response (200 OK):</w:t>
+      </w:r>
+    </w:p>
+    <w:p>
+      <w:pPr>
+        <w:spacing w:before="80" w:after="160"/>
+        <w:ind w:left="360" w:right="360"/>
+        <w:pBdr>
+          <w:left w:val="single" w:sz="24" w:space="8" w:color="4F46E5"/>
+        </w:pBdr>
+        <w:shd w:fill="F8FAFC"/>
+      </w:pPr>
+      <w:r>
+        <w:rPr>
+          <w:rFonts w:ascii="Consolas" w:hAnsi="Consolas"/>
+          <w:color w:val="1E293B"/>
+          <w:sz w:val="18"/>
+        </w:rPr>
+        <w:t>{</w:t>
+        <w:br/>
+        <w:t xml:space="preserve">  "success": true,</w:t>
+        <w:br/>
+        <w:t xml:space="preserve">  "message": "Cập nhật hồ sơ cá nhân thành công",</w:t>
+        <w:br/>
+        <w:t xml:space="preserve">  "data": {</w:t>
+        <w:br/>
+        <w:t xml:space="preserve">    "id": 4,</w:t>
+        <w:br/>
+        <w:t xml:space="preserve">    "email": "sinhvien.khoi@vanlanguni.vn",</w:t>
+        <w:br/>
+        <w:t xml:space="preserve">    "fullName": "Nguyễn Bá Anh Khôi",</w:t>
+        <w:br/>
+        <w:t xml:space="preserve">    "phone": "0912345678",</w:t>
+        <w:br/>
+        <w:t xml:space="preserve">    "bio": "Sinh viên năm cuối ngành CNTT, đam mê React &amp; Spring Boot",</w:t>
+        <w:br/>
+        <w:t xml:space="preserve">    "role": "ROLE_STUDENT"</w:t>
+        <w:br/>
+        <w:t xml:space="preserve">  }</w:t>
+        <w:br/>
+        <w:t>}</w:t>
+      </w:r>
+    </w:p>
     <w:sectPr>
       <w:pgSz w:w="12240" w:h="15840"/>
       <w:pgMar w:top="1440" w:right="1440" w:bottom="1440" w:left="1440" w:header="720" w:footer="720" w:gutter="0"/>

</xml_diff>

<commit_message>
docs: synchronize all project documentation, test plans, reports and docx files with current v1.2 system
</commit_message>
<xml_diff>
--- a/docs/api-contract.docx
+++ b/docs/api-contract.docx
@@ -2764,7 +2764,7 @@
                 <w:color w:val="B42828"/>
                 <w:sz w:val="19"/>
               </w:rPr>
-              <w:t>GET</w:t>
+              <w:t>POST</w:t>
             </w:r>
           </w:p>
         </w:tc>
@@ -2790,7 +2790,7 @@
                 <w:color w:val="B42828"/>
                 <w:sz w:val="19"/>
               </w:rPr>
-              <w:t>/applications/my-applications</w:t>
+              <w:t>/applications/jobs/{jobId}/apply</w:t>
             </w:r>
           </w:p>
         </w:tc>
@@ -2841,7 +2841,7 @@
                 <w:rFonts w:ascii="Segoe UI" w:hAnsi="Segoe UI"/>
                 <w:sz w:val="19"/>
               </w:rPr>
-              <w:t>Lịch sử nộp đơn của sinh viên hiện tại</w:t>
+              <w:t>Nộp hồ sơ ứng tuyển theo URL param</w:t>
             </w:r>
           </w:p>
         </w:tc>
@@ -2913,7 +2913,268 @@
                 <w:color w:val="B42828"/>
                 <w:sz w:val="19"/>
               </w:rPr>
+              <w:t>/applications/my-applications</w:t>
+            </w:r>
+          </w:p>
+        </w:tc>
+        <w:tc>
+          <w:tcPr>
+            <w:tcW w:type="dxa" w:w="1872"/>
+            <w:shd w:fill="F8FAFC"/>
+            <w:tcMar>
+              <w:top w:w="120" w:type="dxa"/>
+              <w:bottom w:w="120" w:type="dxa"/>
+              <w:left w:w="160" w:type="dxa"/>
+              <w:right w:w="160" w:type="dxa"/>
+            </w:tcMar>
+            <w:vAlign w:val="center"/>
+          </w:tcPr>
+          <w:p>
+            <w:pPr>
+              <w:spacing w:before="20" w:after="20" w:line="276" w:lineRule="auto"/>
+            </w:pPr>
+            <w:r>
+              <w:rPr>
+                <w:rFonts w:ascii="Consolas" w:hAnsi="Consolas"/>
+                <w:color w:val="B42828"/>
+                <w:sz w:val="19"/>
+              </w:rPr>
+              <w:t>ROLE_STUDENT</w:t>
+            </w:r>
+          </w:p>
+        </w:tc>
+        <w:tc>
+          <w:tcPr>
+            <w:tcW w:type="dxa" w:w="1872"/>
+            <w:shd w:fill="F8FAFC"/>
+            <w:tcMar>
+              <w:top w:w="120" w:type="dxa"/>
+              <w:bottom w:w="120" w:type="dxa"/>
+              <w:left w:w="160" w:type="dxa"/>
+              <w:right w:w="160" w:type="dxa"/>
+            </w:tcMar>
+            <w:vAlign w:val="center"/>
+          </w:tcPr>
+          <w:p>
+            <w:pPr>
+              <w:spacing w:before="20" w:after="20" w:line="276" w:lineRule="auto"/>
+            </w:pPr>
+            <w:r>
+              <w:rPr>
+                <w:rFonts w:ascii="Segoe UI" w:hAnsi="Segoe UI"/>
+                <w:sz w:val="19"/>
+              </w:rPr>
+              <w:t>Lịch sử nộp đơn của sinh viên hiện tại</w:t>
+            </w:r>
+          </w:p>
+        </w:tc>
+      </w:tr>
+      <w:tr>
+        <w:tc>
+          <w:tcPr>
+            <w:tcW w:type="dxa" w:w="1872"/>
+            <w:shd w:fill="FFFFFF"/>
+            <w:tcMar>
+              <w:top w:w="120" w:type="dxa"/>
+              <w:bottom w:w="120" w:type="dxa"/>
+              <w:left w:w="160" w:type="dxa"/>
+              <w:right w:w="160" w:type="dxa"/>
+            </w:tcMar>
+            <w:vAlign w:val="center"/>
+          </w:tcPr>
+          <w:p>
+            <w:pPr>
+              <w:spacing w:before="20" w:after="20" w:line="276" w:lineRule="auto"/>
+            </w:pPr>
+          </w:p>
+        </w:tc>
+        <w:tc>
+          <w:tcPr>
+            <w:tcW w:type="dxa" w:w="1872"/>
+            <w:shd w:fill="FFFFFF"/>
+            <w:tcMar>
+              <w:top w:w="120" w:type="dxa"/>
+              <w:bottom w:w="120" w:type="dxa"/>
+              <w:left w:w="160" w:type="dxa"/>
+              <w:right w:w="160" w:type="dxa"/>
+            </w:tcMar>
+            <w:vAlign w:val="center"/>
+          </w:tcPr>
+          <w:p>
+            <w:pPr>
+              <w:spacing w:before="20" w:after="20" w:line="276" w:lineRule="auto"/>
+            </w:pPr>
+            <w:r>
+              <w:rPr>
+                <w:rFonts w:ascii="Consolas" w:hAnsi="Consolas"/>
+                <w:color w:val="B42828"/>
+                <w:sz w:val="19"/>
+              </w:rPr>
+              <w:t>GET</w:t>
+            </w:r>
+          </w:p>
+        </w:tc>
+        <w:tc>
+          <w:tcPr>
+            <w:tcW w:type="dxa" w:w="1872"/>
+            <w:shd w:fill="FFFFFF"/>
+            <w:tcMar>
+              <w:top w:w="120" w:type="dxa"/>
+              <w:bottom w:w="120" w:type="dxa"/>
+              <w:left w:w="160" w:type="dxa"/>
+              <w:right w:w="160" w:type="dxa"/>
+            </w:tcMar>
+            <w:vAlign w:val="center"/>
+          </w:tcPr>
+          <w:p>
+            <w:pPr>
+              <w:spacing w:before="20" w:after="20" w:line="276" w:lineRule="auto"/>
+            </w:pPr>
+            <w:r>
+              <w:rPr>
+                <w:rFonts w:ascii="Consolas" w:hAnsi="Consolas"/>
+                <w:color w:val="B42828"/>
+                <w:sz w:val="19"/>
+              </w:rPr>
               <w:t>/applications/job/{jobId}</w:t>
+            </w:r>
+          </w:p>
+        </w:tc>
+        <w:tc>
+          <w:tcPr>
+            <w:tcW w:type="dxa" w:w="1872"/>
+            <w:shd w:fill="FFFFFF"/>
+            <w:tcMar>
+              <w:top w:w="120" w:type="dxa"/>
+              <w:bottom w:w="120" w:type="dxa"/>
+              <w:left w:w="160" w:type="dxa"/>
+              <w:right w:w="160" w:type="dxa"/>
+            </w:tcMar>
+            <w:vAlign w:val="center"/>
+          </w:tcPr>
+          <w:p>
+            <w:pPr>
+              <w:spacing w:before="20" w:after="20" w:line="276" w:lineRule="auto"/>
+            </w:pPr>
+            <w:r>
+              <w:rPr>
+                <w:rFonts w:ascii="Consolas" w:hAnsi="Consolas"/>
+                <w:color w:val="B42828"/>
+                <w:sz w:val="19"/>
+              </w:rPr>
+              <w:t>ROLE_EMPLOYER</w:t>
+            </w:r>
+            <w:r>
+              <w:rPr>
+                <w:rFonts w:ascii="Segoe UI" w:hAnsi="Segoe UI"/>
+                <w:sz w:val="19"/>
+              </w:rPr>
+              <w:t xml:space="preserve">, </w:t>
+            </w:r>
+            <w:r>
+              <w:rPr>
+                <w:rFonts w:ascii="Consolas" w:hAnsi="Consolas"/>
+                <w:color w:val="B42828"/>
+                <w:sz w:val="19"/>
+              </w:rPr>
+              <w:t>ROLE_ADMIN</w:t>
+            </w:r>
+          </w:p>
+        </w:tc>
+        <w:tc>
+          <w:tcPr>
+            <w:tcW w:type="dxa" w:w="1872"/>
+            <w:shd w:fill="FFFFFF"/>
+            <w:tcMar>
+              <w:top w:w="120" w:type="dxa"/>
+              <w:bottom w:w="120" w:type="dxa"/>
+              <w:left w:w="160" w:type="dxa"/>
+              <w:right w:w="160" w:type="dxa"/>
+            </w:tcMar>
+            <w:vAlign w:val="center"/>
+          </w:tcPr>
+          <w:p>
+            <w:pPr>
+              <w:spacing w:before="20" w:after="20" w:line="276" w:lineRule="auto"/>
+            </w:pPr>
+            <w:r>
+              <w:rPr>
+                <w:rFonts w:ascii="Segoe UI" w:hAnsi="Segoe UI"/>
+                <w:sz w:val="19"/>
+              </w:rPr>
+              <w:t>Xem danh sách ứng viên nộp vào tin</w:t>
+            </w:r>
+          </w:p>
+        </w:tc>
+      </w:tr>
+      <w:tr>
+        <w:tc>
+          <w:tcPr>
+            <w:tcW w:type="dxa" w:w="1872"/>
+            <w:shd w:fill="F8FAFC"/>
+            <w:tcMar>
+              <w:top w:w="120" w:type="dxa"/>
+              <w:bottom w:w="120" w:type="dxa"/>
+              <w:left w:w="160" w:type="dxa"/>
+              <w:right w:w="160" w:type="dxa"/>
+            </w:tcMar>
+            <w:vAlign w:val="center"/>
+          </w:tcPr>
+          <w:p>
+            <w:pPr>
+              <w:spacing w:before="20" w:after="20" w:line="276" w:lineRule="auto"/>
+            </w:pPr>
+          </w:p>
+        </w:tc>
+        <w:tc>
+          <w:tcPr>
+            <w:tcW w:type="dxa" w:w="1872"/>
+            <w:shd w:fill="F8FAFC"/>
+            <w:tcMar>
+              <w:top w:w="120" w:type="dxa"/>
+              <w:bottom w:w="120" w:type="dxa"/>
+              <w:left w:w="160" w:type="dxa"/>
+              <w:right w:w="160" w:type="dxa"/>
+            </w:tcMar>
+            <w:vAlign w:val="center"/>
+          </w:tcPr>
+          <w:p>
+            <w:pPr>
+              <w:spacing w:before="20" w:after="20" w:line="276" w:lineRule="auto"/>
+            </w:pPr>
+            <w:r>
+              <w:rPr>
+                <w:rFonts w:ascii="Consolas" w:hAnsi="Consolas"/>
+                <w:color w:val="B42828"/>
+                <w:sz w:val="19"/>
+              </w:rPr>
+              <w:t>PATCH</w:t>
+            </w:r>
+          </w:p>
+        </w:tc>
+        <w:tc>
+          <w:tcPr>
+            <w:tcW w:type="dxa" w:w="1872"/>
+            <w:shd w:fill="F8FAFC"/>
+            <w:tcMar>
+              <w:top w:w="120" w:type="dxa"/>
+              <w:bottom w:w="120" w:type="dxa"/>
+              <w:left w:w="160" w:type="dxa"/>
+              <w:right w:w="160" w:type="dxa"/>
+            </w:tcMar>
+            <w:vAlign w:val="center"/>
+          </w:tcPr>
+          <w:p>
+            <w:pPr>
+              <w:spacing w:before="20" w:after="20" w:line="276" w:lineRule="auto"/>
+            </w:pPr>
+            <w:r>
+              <w:rPr>
+                <w:rFonts w:ascii="Consolas" w:hAnsi="Consolas"/>
+                <w:color w:val="B42828"/>
+                <w:sz w:val="19"/>
+              </w:rPr>
+              <w:t>/applications/{id}/status</w:t>
             </w:r>
           </w:p>
         </w:tc>
@@ -2979,7 +3240,37 @@
                 <w:rFonts w:ascii="Segoe UI" w:hAnsi="Segoe UI"/>
                 <w:sz w:val="19"/>
               </w:rPr>
-              <w:t>Xem danh sách ứng viên nộp vào tin</w:t>
+              <w:t>Duyệt (</w:t>
+            </w:r>
+            <w:r>
+              <w:rPr>
+                <w:rFonts w:ascii="Consolas" w:hAnsi="Consolas"/>
+                <w:color w:val="B42828"/>
+                <w:sz w:val="19"/>
+              </w:rPr>
+              <w:t>ACCEPTED</w:t>
+            </w:r>
+            <w:r>
+              <w:rPr>
+                <w:rFonts w:ascii="Segoe UI" w:hAnsi="Segoe UI"/>
+                <w:sz w:val="19"/>
+              </w:rPr>
+              <w:t>) hoặc từ chối (</w:t>
+            </w:r>
+            <w:r>
+              <w:rPr>
+                <w:rFonts w:ascii="Consolas" w:hAnsi="Consolas"/>
+                <w:color w:val="B42828"/>
+                <w:sz w:val="19"/>
+              </w:rPr>
+              <w:t>REJECTED</w:t>
+            </w:r>
+            <w:r>
+              <w:rPr>
+                <w:rFonts w:ascii="Segoe UI" w:hAnsi="Segoe UI"/>
+                <w:sz w:val="19"/>
+              </w:rPr>
+              <w:t>) đơn</w:t>
             </w:r>
           </w:p>
         </w:tc>
@@ -3051,7 +3342,7 @@
                 <w:color w:val="B42828"/>
                 <w:sz w:val="19"/>
               </w:rPr>
-              <w:t>/applications/{id}/status</w:t>
+              <w:t>/applications/{id}/cancel</w:t>
             </w:r>
           </w:p>
         </w:tc>
@@ -3077,22 +3368,7 @@
                 <w:color w:val="B42828"/>
                 <w:sz w:val="19"/>
               </w:rPr>
-              <w:t>ROLE_EMPLOYER</w:t>
-            </w:r>
-            <w:r>
-              <w:rPr>
-                <w:rFonts w:ascii="Segoe UI" w:hAnsi="Segoe UI"/>
-                <w:sz w:val="19"/>
-              </w:rPr>
-              <w:t xml:space="preserve">, </w:t>
-            </w:r>
-            <w:r>
-              <w:rPr>
-                <w:rFonts w:ascii="Consolas" w:hAnsi="Consolas"/>
-                <w:color w:val="B42828"/>
-                <w:sz w:val="19"/>
-              </w:rPr>
-              <w:t>ROLE_ADMIN</w:t>
+              <w:t>ROLE_STUDENT</w:t>
             </w:r>
           </w:p>
         </w:tc>
@@ -3100,159 +3376,6 @@
           <w:tcPr>
             <w:tcW w:type="dxa" w:w="1872"/>
             <w:shd w:fill="FFFFFF"/>
-            <w:tcMar>
-              <w:top w:w="120" w:type="dxa"/>
-              <w:bottom w:w="120" w:type="dxa"/>
-              <w:left w:w="160" w:type="dxa"/>
-              <w:right w:w="160" w:type="dxa"/>
-            </w:tcMar>
-            <w:vAlign w:val="center"/>
-          </w:tcPr>
-          <w:p>
-            <w:pPr>
-              <w:spacing w:before="20" w:after="20" w:line="276" w:lineRule="auto"/>
-            </w:pPr>
-            <w:r>
-              <w:rPr>
-                <w:rFonts w:ascii="Segoe UI" w:hAnsi="Segoe UI"/>
-                <w:sz w:val="19"/>
-              </w:rPr>
-              <w:t>Duyệt (</w:t>
-            </w:r>
-            <w:r>
-              <w:rPr>
-                <w:rFonts w:ascii="Consolas" w:hAnsi="Consolas"/>
-                <w:color w:val="B42828"/>
-                <w:sz w:val="19"/>
-              </w:rPr>
-              <w:t>ACCEPTED</w:t>
-            </w:r>
-            <w:r>
-              <w:rPr>
-                <w:rFonts w:ascii="Segoe UI" w:hAnsi="Segoe UI"/>
-                <w:sz w:val="19"/>
-              </w:rPr>
-              <w:t>) hoặc từ chối (</w:t>
-            </w:r>
-            <w:r>
-              <w:rPr>
-                <w:rFonts w:ascii="Consolas" w:hAnsi="Consolas"/>
-                <w:color w:val="B42828"/>
-                <w:sz w:val="19"/>
-              </w:rPr>
-              <w:t>REJECTED</w:t>
-            </w:r>
-            <w:r>
-              <w:rPr>
-                <w:rFonts w:ascii="Segoe UI" w:hAnsi="Segoe UI"/>
-                <w:sz w:val="19"/>
-              </w:rPr>
-              <w:t>) đơn</w:t>
-            </w:r>
-          </w:p>
-        </w:tc>
-      </w:tr>
-      <w:tr>
-        <w:tc>
-          <w:tcPr>
-            <w:tcW w:type="dxa" w:w="1872"/>
-            <w:shd w:fill="F8FAFC"/>
-            <w:tcMar>
-              <w:top w:w="120" w:type="dxa"/>
-              <w:bottom w:w="120" w:type="dxa"/>
-              <w:left w:w="160" w:type="dxa"/>
-              <w:right w:w="160" w:type="dxa"/>
-            </w:tcMar>
-            <w:vAlign w:val="center"/>
-          </w:tcPr>
-          <w:p>
-            <w:pPr>
-              <w:spacing w:before="20" w:after="20" w:line="276" w:lineRule="auto"/>
-            </w:pPr>
-          </w:p>
-        </w:tc>
-        <w:tc>
-          <w:tcPr>
-            <w:tcW w:type="dxa" w:w="1872"/>
-            <w:shd w:fill="F8FAFC"/>
-            <w:tcMar>
-              <w:top w:w="120" w:type="dxa"/>
-              <w:bottom w:w="120" w:type="dxa"/>
-              <w:left w:w="160" w:type="dxa"/>
-              <w:right w:w="160" w:type="dxa"/>
-            </w:tcMar>
-            <w:vAlign w:val="center"/>
-          </w:tcPr>
-          <w:p>
-            <w:pPr>
-              <w:spacing w:before="20" w:after="20" w:line="276" w:lineRule="auto"/>
-            </w:pPr>
-            <w:r>
-              <w:rPr>
-                <w:rFonts w:ascii="Consolas" w:hAnsi="Consolas"/>
-                <w:color w:val="B42828"/>
-                <w:sz w:val="19"/>
-              </w:rPr>
-              <w:t>PATCH</w:t>
-            </w:r>
-          </w:p>
-        </w:tc>
-        <w:tc>
-          <w:tcPr>
-            <w:tcW w:type="dxa" w:w="1872"/>
-            <w:shd w:fill="F8FAFC"/>
-            <w:tcMar>
-              <w:top w:w="120" w:type="dxa"/>
-              <w:bottom w:w="120" w:type="dxa"/>
-              <w:left w:w="160" w:type="dxa"/>
-              <w:right w:w="160" w:type="dxa"/>
-            </w:tcMar>
-            <w:vAlign w:val="center"/>
-          </w:tcPr>
-          <w:p>
-            <w:pPr>
-              <w:spacing w:before="20" w:after="20" w:line="276" w:lineRule="auto"/>
-            </w:pPr>
-            <w:r>
-              <w:rPr>
-                <w:rFonts w:ascii="Consolas" w:hAnsi="Consolas"/>
-                <w:color w:val="B42828"/>
-                <w:sz w:val="19"/>
-              </w:rPr>
-              <w:t>/applications/{id}/cancel</w:t>
-            </w:r>
-          </w:p>
-        </w:tc>
-        <w:tc>
-          <w:tcPr>
-            <w:tcW w:type="dxa" w:w="1872"/>
-            <w:shd w:fill="F8FAFC"/>
-            <w:tcMar>
-              <w:top w:w="120" w:type="dxa"/>
-              <w:bottom w:w="120" w:type="dxa"/>
-              <w:left w:w="160" w:type="dxa"/>
-              <w:right w:w="160" w:type="dxa"/>
-            </w:tcMar>
-            <w:vAlign w:val="center"/>
-          </w:tcPr>
-          <w:p>
-            <w:pPr>
-              <w:spacing w:before="20" w:after="20" w:line="276" w:lineRule="auto"/>
-            </w:pPr>
-            <w:r>
-              <w:rPr>
-                <w:rFonts w:ascii="Consolas" w:hAnsi="Consolas"/>
-                <w:color w:val="B42828"/>
-                <w:sz w:val="19"/>
-              </w:rPr>
-              <w:t>ROLE_STUDENT</w:t>
-            </w:r>
-          </w:p>
-        </w:tc>
-        <w:tc>
-          <w:tcPr>
-            <w:tcW w:type="dxa" w:w="1872"/>
-            <w:shd w:fill="F8FAFC"/>
             <w:tcMar>
               <w:top w:w="120" w:type="dxa"/>
               <w:bottom w:w="120" w:type="dxa"/>
@@ -3287,7 +3410,7 @@
         <w:tc>
           <w:tcPr>
             <w:tcW w:type="dxa" w:w="1872"/>
-            <w:shd w:fill="FFFFFF"/>
+            <w:shd w:fill="F8FAFC"/>
             <w:tcMar>
               <w:top w:w="120" w:type="dxa"/>
               <w:bottom w:w="120" w:type="dxa"/>
@@ -3305,6 +3428,154 @@
                 <w:b/>
               </w:rPr>
               <w:t>Reviews</w:t>
+            </w:r>
+          </w:p>
+        </w:tc>
+        <w:tc>
+          <w:tcPr>
+            <w:tcW w:type="dxa" w:w="1872"/>
+            <w:shd w:fill="F8FAFC"/>
+            <w:tcMar>
+              <w:top w:w="120" w:type="dxa"/>
+              <w:bottom w:w="120" w:type="dxa"/>
+              <w:left w:w="160" w:type="dxa"/>
+              <w:right w:w="160" w:type="dxa"/>
+            </w:tcMar>
+            <w:vAlign w:val="center"/>
+          </w:tcPr>
+          <w:p>
+            <w:pPr>
+              <w:spacing w:before="20" w:after="20" w:line="276" w:lineRule="auto"/>
+            </w:pPr>
+            <w:r>
+              <w:rPr>
+                <w:rFonts w:ascii="Consolas" w:hAnsi="Consolas"/>
+                <w:color w:val="B42828"/>
+                <w:sz w:val="19"/>
+              </w:rPr>
+              <w:t>POST</w:t>
+            </w:r>
+          </w:p>
+        </w:tc>
+        <w:tc>
+          <w:tcPr>
+            <w:tcW w:type="dxa" w:w="1872"/>
+            <w:shd w:fill="F8FAFC"/>
+            <w:tcMar>
+              <w:top w:w="120" w:type="dxa"/>
+              <w:bottom w:w="120" w:type="dxa"/>
+              <w:left w:w="160" w:type="dxa"/>
+              <w:right w:w="160" w:type="dxa"/>
+            </w:tcMar>
+            <w:vAlign w:val="center"/>
+          </w:tcPr>
+          <w:p>
+            <w:pPr>
+              <w:spacing w:before="20" w:after="20" w:line="276" w:lineRule="auto"/>
+            </w:pPr>
+            <w:r>
+              <w:rPr>
+                <w:rFonts w:ascii="Consolas" w:hAnsi="Consolas"/>
+                <w:color w:val="B42828"/>
+                <w:sz w:val="19"/>
+              </w:rPr>
+              <w:t>/reviews</w:t>
+            </w:r>
+          </w:p>
+        </w:tc>
+        <w:tc>
+          <w:tcPr>
+            <w:tcW w:type="dxa" w:w="1872"/>
+            <w:shd w:fill="F8FAFC"/>
+            <w:tcMar>
+              <w:top w:w="120" w:type="dxa"/>
+              <w:bottom w:w="120" w:type="dxa"/>
+              <w:left w:w="160" w:type="dxa"/>
+              <w:right w:w="160" w:type="dxa"/>
+            </w:tcMar>
+            <w:vAlign w:val="center"/>
+          </w:tcPr>
+          <w:p>
+            <w:pPr>
+              <w:spacing w:before="20" w:after="20" w:line="276" w:lineRule="auto"/>
+            </w:pPr>
+            <w:r>
+              <w:rPr>
+                <w:rFonts w:ascii="Segoe UI" w:hAnsi="Segoe UI"/>
+                <w:sz w:val="19"/>
+              </w:rPr>
+              <w:t>Authenticated</w:t>
+            </w:r>
+          </w:p>
+        </w:tc>
+        <w:tc>
+          <w:tcPr>
+            <w:tcW w:type="dxa" w:w="1872"/>
+            <w:shd w:fill="F8FAFC"/>
+            <w:tcMar>
+              <w:top w:w="120" w:type="dxa"/>
+              <w:bottom w:w="120" w:type="dxa"/>
+              <w:left w:w="160" w:type="dxa"/>
+              <w:right w:w="160" w:type="dxa"/>
+            </w:tcMar>
+            <w:vAlign w:val="center"/>
+          </w:tcPr>
+          <w:p>
+            <w:pPr>
+              <w:spacing w:before="20" w:after="20" w:line="276" w:lineRule="auto"/>
+            </w:pPr>
+            <w:r>
+              <w:rPr>
+                <w:rFonts w:ascii="Segoe UI" w:hAnsi="Segoe UI"/>
+                <w:sz w:val="19"/>
+              </w:rPr>
+              <w:t>Gửi đánh giá hai chiều (1–5 sao kèm nhận xét)</w:t>
+            </w:r>
+          </w:p>
+        </w:tc>
+      </w:tr>
+      <w:tr>
+        <w:tc>
+          <w:tcPr>
+            <w:tcW w:type="dxa" w:w="1872"/>
+            <w:shd w:fill="FFFFFF"/>
+            <w:tcMar>
+              <w:top w:w="120" w:type="dxa"/>
+              <w:bottom w:w="120" w:type="dxa"/>
+              <w:left w:w="160" w:type="dxa"/>
+              <w:right w:w="160" w:type="dxa"/>
+            </w:tcMar>
+            <w:vAlign w:val="center"/>
+          </w:tcPr>
+          <w:p>
+            <w:pPr>
+              <w:spacing w:before="20" w:after="20" w:line="276" w:lineRule="auto"/>
+            </w:pPr>
+          </w:p>
+        </w:tc>
+        <w:tc>
+          <w:tcPr>
+            <w:tcW w:type="dxa" w:w="1872"/>
+            <w:shd w:fill="FFFFFF"/>
+            <w:tcMar>
+              <w:top w:w="120" w:type="dxa"/>
+              <w:bottom w:w="120" w:type="dxa"/>
+              <w:left w:w="160" w:type="dxa"/>
+              <w:right w:w="160" w:type="dxa"/>
+            </w:tcMar>
+            <w:vAlign w:val="center"/>
+          </w:tcPr>
+          <w:p>
+            <w:pPr>
+              <w:spacing w:before="20" w:after="20" w:line="276" w:lineRule="auto"/>
+            </w:pPr>
+            <w:r>
+              <w:rPr>
+                <w:rFonts w:ascii="Consolas" w:hAnsi="Consolas"/>
+                <w:color w:val="B42828"/>
+                <w:sz w:val="19"/>
+              </w:rPr>
+              <w:t>GET</w:t>
             </w:r>
           </w:p>
         </w:tc>
@@ -3330,33 +3601,7 @@
                 <w:color w:val="B42828"/>
                 <w:sz w:val="19"/>
               </w:rPr>
-              <w:t>POST</w:t>
-            </w:r>
-          </w:p>
-        </w:tc>
-        <w:tc>
-          <w:tcPr>
-            <w:tcW w:type="dxa" w:w="1872"/>
-            <w:shd w:fill="FFFFFF"/>
-            <w:tcMar>
-              <w:top w:w="120" w:type="dxa"/>
-              <w:bottom w:w="120" w:type="dxa"/>
-              <w:left w:w="160" w:type="dxa"/>
-              <w:right w:w="160" w:type="dxa"/>
-            </w:tcMar>
-            <w:vAlign w:val="center"/>
-          </w:tcPr>
-          <w:p>
-            <w:pPr>
-              <w:spacing w:before="20" w:after="20" w:line="276" w:lineRule="auto"/>
-            </w:pPr>
-            <w:r>
-              <w:rPr>
-                <w:rFonts w:ascii="Consolas" w:hAnsi="Consolas"/>
-                <w:color w:val="B42828"/>
-                <w:sz w:val="19"/>
-              </w:rPr>
-              <w:t>/reviews</w:t>
+              <w:t>/reviews/job/{jobId}</w:t>
             </w:r>
           </w:p>
         </w:tc>
@@ -3381,7 +3626,7 @@
                 <w:rFonts w:ascii="Segoe UI" w:hAnsi="Segoe UI"/>
                 <w:sz w:val="19"/>
               </w:rPr>
-              <w:t>Authenticated</w:t>
+              <w:t>Public</w:t>
             </w:r>
           </w:p>
         </w:tc>
@@ -3406,7 +3651,7 @@
                 <w:rFonts w:ascii="Segoe UI" w:hAnsi="Segoe UI"/>
                 <w:sz w:val="19"/>
               </w:rPr>
-              <w:t>Gửi đánh giá hai chiều (1–5 sao kèm nhận xét)</w:t>
+              <w:t>Lấy tất cả đánh giá của một công việc</w:t>
             </w:r>
           </w:p>
         </w:tc>
@@ -3478,7 +3723,7 @@
                 <w:color w:val="B42828"/>
                 <w:sz w:val="19"/>
               </w:rPr>
-              <w:t>/reviews/job/{jobId}</w:t>
+              <w:t>/reviews/job/{jobId}/has-reviewed</w:t>
             </w:r>
           </w:p>
         </w:tc>
@@ -3503,7 +3748,7 @@
                 <w:rFonts w:ascii="Segoe UI" w:hAnsi="Segoe UI"/>
                 <w:sz w:val="19"/>
               </w:rPr>
-              <w:t>Public</w:t>
+              <w:t>Authenticated</w:t>
             </w:r>
           </w:p>
         </w:tc>
@@ -3528,7 +3773,7 @@
                 <w:rFonts w:ascii="Segoe UI" w:hAnsi="Segoe UI"/>
                 <w:sz w:val="19"/>
               </w:rPr>
-              <w:t>Lấy tất cả đánh giá của một công việc</w:t>
+              <w:t>Kiểm tra người dùng đã đánh giá công việc này chưa</w:t>
             </w:r>
           </w:p>
         </w:tc>
@@ -3672,12 +3917,6 @@
             <w:pPr>
               <w:spacing w:before="20" w:after="20" w:line="276" w:lineRule="auto"/>
             </w:pPr>
-            <w:r>
-              <w:rPr>
-                <w:b/>
-              </w:rPr>
-              <w:t>Users</w:t>
-            </w:r>
           </w:p>
         </w:tc>
         <w:tc>
@@ -3728,7 +3967,7 @@
                 <w:color w:val="B42828"/>
                 <w:sz w:val="19"/>
               </w:rPr>
-              <w:t>/users/{id}</w:t>
+              <w:t>/reviews/user/{userId}/rating</w:t>
             </w:r>
           </w:p>
         </w:tc>
@@ -3778,7 +4017,7 @@
                 <w:rFonts w:ascii="Segoe UI" w:hAnsi="Segoe UI"/>
                 <w:sz w:val="19"/>
               </w:rPr>
-              <w:t>Xem hồ sơ công khai của người dùng theo ID</w:t>
+              <w:t>Lấy điểm sao trung bình của một người dùng</w:t>
             </w:r>
           </w:p>
         </w:tc>
@@ -3800,31 +4039,11 @@
             <w:pPr>
               <w:spacing w:before="20" w:after="20" w:line="276" w:lineRule="auto"/>
             </w:pPr>
-          </w:p>
-        </w:tc>
-        <w:tc>
-          <w:tcPr>
-            <w:tcW w:type="dxa" w:w="1872"/>
-            <w:shd w:fill="FFFFFF"/>
-            <w:tcMar>
-              <w:top w:w="120" w:type="dxa"/>
-              <w:bottom w:w="120" w:type="dxa"/>
-              <w:left w:w="160" w:type="dxa"/>
-              <w:right w:w="160" w:type="dxa"/>
-            </w:tcMar>
-            <w:vAlign w:val="center"/>
-          </w:tcPr>
-          <w:p>
-            <w:pPr>
-              <w:spacing w:before="20" w:after="20" w:line="276" w:lineRule="auto"/>
-            </w:pPr>
             <w:r>
               <w:rPr>
-                <w:rFonts w:ascii="Consolas" w:hAnsi="Consolas"/>
-                <w:color w:val="B42828"/>
-                <w:sz w:val="19"/>
+                <w:b/>
               </w:rPr>
-              <w:t>PUT</w:t>
+              <w:t>Users</w:t>
             </w:r>
           </w:p>
         </w:tc>
@@ -3850,7 +4069,33 @@
                 <w:color w:val="B42828"/>
                 <w:sz w:val="19"/>
               </w:rPr>
-              <w:t>/users/profile</w:t>
+              <w:t>GET</w:t>
+            </w:r>
+          </w:p>
+        </w:tc>
+        <w:tc>
+          <w:tcPr>
+            <w:tcW w:type="dxa" w:w="1872"/>
+            <w:shd w:fill="FFFFFF"/>
+            <w:tcMar>
+              <w:top w:w="120" w:type="dxa"/>
+              <w:bottom w:w="120" w:type="dxa"/>
+              <w:left w:w="160" w:type="dxa"/>
+              <w:right w:w="160" w:type="dxa"/>
+            </w:tcMar>
+            <w:vAlign w:val="center"/>
+          </w:tcPr>
+          <w:p>
+            <w:pPr>
+              <w:spacing w:before="20" w:after="20" w:line="276" w:lineRule="auto"/>
+            </w:pPr>
+            <w:r>
+              <w:rPr>
+                <w:rFonts w:ascii="Consolas" w:hAnsi="Consolas"/>
+                <w:color w:val="B42828"/>
+                <w:sz w:val="19"/>
+              </w:rPr>
+              <w:t>/users/{id}</w:t>
             </w:r>
           </w:p>
         </w:tc>
@@ -3875,7 +4120,7 @@
                 <w:rFonts w:ascii="Segoe UI" w:hAnsi="Segoe UI"/>
                 <w:sz w:val="19"/>
               </w:rPr>
-              <w:t>Authenticated</w:t>
+              <w:t>Public</w:t>
             </w:r>
           </w:p>
         </w:tc>
@@ -3900,7 +4145,7 @@
                 <w:rFonts w:ascii="Segoe UI" w:hAnsi="Segoe UI"/>
                 <w:sz w:val="19"/>
               </w:rPr>
-              <w:t>Cập nhật hồ sơ cá nhân đa vai trò (Sinh viên, NTD, Admin)</w:t>
+              <w:t>Xem hồ sơ công khai của người dùng theo ID</w:t>
             </w:r>
           </w:p>
         </w:tc>
@@ -3972,33 +4217,7 @@
                 <w:color w:val="B42828"/>
                 <w:sz w:val="19"/>
               </w:rPr>
-              <w:t>/students/me</w:t>
-            </w:r>
-          </w:p>
-        </w:tc>
-        <w:tc>
-          <w:tcPr>
-            <w:tcW w:type="dxa" w:w="1872"/>
-            <w:shd w:fill="F8FAFC"/>
-            <w:tcMar>
-              <w:top w:w="120" w:type="dxa"/>
-              <w:bottom w:w="120" w:type="dxa"/>
-              <w:left w:w="160" w:type="dxa"/>
-              <w:right w:w="160" w:type="dxa"/>
-            </w:tcMar>
-            <w:vAlign w:val="center"/>
-          </w:tcPr>
-          <w:p>
-            <w:pPr>
-              <w:spacing w:before="20" w:after="20" w:line="276" w:lineRule="auto"/>
-            </w:pPr>
-            <w:r>
-              <w:rPr>
-                <w:rFonts w:ascii="Consolas" w:hAnsi="Consolas"/>
-                <w:color w:val="B42828"/>
-                <w:sz w:val="19"/>
-              </w:rPr>
-              <w:t>ROLE_STUDENT</w:t>
+              <w:t>/users/profile</w:t>
             </w:r>
           </w:p>
         </w:tc>
@@ -4023,7 +4242,32 @@
                 <w:rFonts w:ascii="Segoe UI" w:hAnsi="Segoe UI"/>
                 <w:sz w:val="19"/>
               </w:rPr>
-              <w:t>Cập nhật hồ sơ học vấn, kỹ năng và CV cho sinh viên</w:t>
+              <w:t>Authenticated</w:t>
+            </w:r>
+          </w:p>
+        </w:tc>
+        <w:tc>
+          <w:tcPr>
+            <w:tcW w:type="dxa" w:w="1872"/>
+            <w:shd w:fill="F8FAFC"/>
+            <w:tcMar>
+              <w:top w:w="120" w:type="dxa"/>
+              <w:bottom w:w="120" w:type="dxa"/>
+              <w:left w:w="160" w:type="dxa"/>
+              <w:right w:w="160" w:type="dxa"/>
+            </w:tcMar>
+            <w:vAlign w:val="center"/>
+          </w:tcPr>
+          <w:p>
+            <w:pPr>
+              <w:spacing w:before="20" w:after="20" w:line="276" w:lineRule="auto"/>
+            </w:pPr>
+            <w:r>
+              <w:rPr>
+                <w:rFonts w:ascii="Segoe UI" w:hAnsi="Segoe UI"/>
+                <w:sz w:val="19"/>
+              </w:rPr>
+              <w:t>Cập nhật hồ sơ cá nhân đa vai trò (Sinh viên, NTD, Admin)</w:t>
             </w:r>
           </w:p>
         </w:tc>
@@ -4417,12 +4661,6 @@
             <w:pPr>
               <w:spacing w:before="20" w:after="20" w:line="276" w:lineRule="auto"/>
             </w:pPr>
-            <w:r>
-              <w:rPr>
-                <w:b/>
-              </w:rPr>
-              <w:t>Admin</w:t>
-            </w:r>
           </w:p>
         </w:tc>
         <w:tc>
@@ -4473,7 +4711,258 @@
                 <w:color w:val="B42828"/>
                 <w:sz w:val="19"/>
               </w:rPr>
+              <w:t>/notifications/unread-count</w:t>
+            </w:r>
+          </w:p>
+        </w:tc>
+        <w:tc>
+          <w:tcPr>
+            <w:tcW w:type="dxa" w:w="1872"/>
+            <w:shd w:fill="F8FAFC"/>
+            <w:tcMar>
+              <w:top w:w="120" w:type="dxa"/>
+              <w:bottom w:w="120" w:type="dxa"/>
+              <w:left w:w="160" w:type="dxa"/>
+              <w:right w:w="160" w:type="dxa"/>
+            </w:tcMar>
+            <w:vAlign w:val="center"/>
+          </w:tcPr>
+          <w:p>
+            <w:pPr>
+              <w:spacing w:before="20" w:after="20" w:line="276" w:lineRule="auto"/>
+            </w:pPr>
+            <w:r>
+              <w:rPr>
+                <w:rFonts w:ascii="Segoe UI" w:hAnsi="Segoe UI"/>
+                <w:sz w:val="19"/>
+              </w:rPr>
+              <w:t>Authenticated</w:t>
+            </w:r>
+          </w:p>
+        </w:tc>
+        <w:tc>
+          <w:tcPr>
+            <w:tcW w:type="dxa" w:w="1872"/>
+            <w:shd w:fill="F8FAFC"/>
+            <w:tcMar>
+              <w:top w:w="120" w:type="dxa"/>
+              <w:bottom w:w="120" w:type="dxa"/>
+              <w:left w:w="160" w:type="dxa"/>
+              <w:right w:w="160" w:type="dxa"/>
+            </w:tcMar>
+            <w:vAlign w:val="center"/>
+          </w:tcPr>
+          <w:p>
+            <w:pPr>
+              <w:spacing w:before="20" w:after="20" w:line="276" w:lineRule="auto"/>
+            </w:pPr>
+            <w:r>
+              <w:rPr>
+                <w:rFonts w:ascii="Segoe UI" w:hAnsi="Segoe UI"/>
+                <w:sz w:val="19"/>
+              </w:rPr>
+              <w:t>Lấy số lượng thông báo chưa đọc của tài khoản</w:t>
+            </w:r>
+          </w:p>
+        </w:tc>
+      </w:tr>
+      <w:tr>
+        <w:tc>
+          <w:tcPr>
+            <w:tcW w:type="dxa" w:w="1872"/>
+            <w:shd w:fill="FFFFFF"/>
+            <w:tcMar>
+              <w:top w:w="120" w:type="dxa"/>
+              <w:bottom w:w="120" w:type="dxa"/>
+              <w:left w:w="160" w:type="dxa"/>
+              <w:right w:w="160" w:type="dxa"/>
+            </w:tcMar>
+            <w:vAlign w:val="center"/>
+          </w:tcPr>
+          <w:p>
+            <w:pPr>
+              <w:spacing w:before="20" w:after="20" w:line="276" w:lineRule="auto"/>
+            </w:pPr>
+            <w:r>
+              <w:rPr>
+                <w:b/>
+              </w:rPr>
+              <w:t>Admin</w:t>
+            </w:r>
+          </w:p>
+        </w:tc>
+        <w:tc>
+          <w:tcPr>
+            <w:tcW w:type="dxa" w:w="1872"/>
+            <w:shd w:fill="FFFFFF"/>
+            <w:tcMar>
+              <w:top w:w="120" w:type="dxa"/>
+              <w:bottom w:w="120" w:type="dxa"/>
+              <w:left w:w="160" w:type="dxa"/>
+              <w:right w:w="160" w:type="dxa"/>
+            </w:tcMar>
+            <w:vAlign w:val="center"/>
+          </w:tcPr>
+          <w:p>
+            <w:pPr>
+              <w:spacing w:before="20" w:after="20" w:line="276" w:lineRule="auto"/>
+            </w:pPr>
+            <w:r>
+              <w:rPr>
+                <w:rFonts w:ascii="Consolas" w:hAnsi="Consolas"/>
+                <w:color w:val="B42828"/>
+                <w:sz w:val="19"/>
+              </w:rPr>
+              <w:t>GET</w:t>
+            </w:r>
+          </w:p>
+        </w:tc>
+        <w:tc>
+          <w:tcPr>
+            <w:tcW w:type="dxa" w:w="1872"/>
+            <w:shd w:fill="FFFFFF"/>
+            <w:tcMar>
+              <w:top w:w="120" w:type="dxa"/>
+              <w:bottom w:w="120" w:type="dxa"/>
+              <w:left w:w="160" w:type="dxa"/>
+              <w:right w:w="160" w:type="dxa"/>
+            </w:tcMar>
+            <w:vAlign w:val="center"/>
+          </w:tcPr>
+          <w:p>
+            <w:pPr>
+              <w:spacing w:before="20" w:after="20" w:line="276" w:lineRule="auto"/>
+            </w:pPr>
+            <w:r>
+              <w:rPr>
+                <w:rFonts w:ascii="Consolas" w:hAnsi="Consolas"/>
+                <w:color w:val="B42828"/>
+                <w:sz w:val="19"/>
+              </w:rPr>
               <w:t>/admin/stats</w:t>
+            </w:r>
+          </w:p>
+        </w:tc>
+        <w:tc>
+          <w:tcPr>
+            <w:tcW w:type="dxa" w:w="1872"/>
+            <w:shd w:fill="FFFFFF"/>
+            <w:tcMar>
+              <w:top w:w="120" w:type="dxa"/>
+              <w:bottom w:w="120" w:type="dxa"/>
+              <w:left w:w="160" w:type="dxa"/>
+              <w:right w:w="160" w:type="dxa"/>
+            </w:tcMar>
+            <w:vAlign w:val="center"/>
+          </w:tcPr>
+          <w:p>
+            <w:pPr>
+              <w:spacing w:before="20" w:after="20" w:line="276" w:lineRule="auto"/>
+            </w:pPr>
+            <w:r>
+              <w:rPr>
+                <w:rFonts w:ascii="Consolas" w:hAnsi="Consolas"/>
+                <w:color w:val="B42828"/>
+                <w:sz w:val="19"/>
+              </w:rPr>
+              <w:t>ROLE_ADMIN</w:t>
+            </w:r>
+          </w:p>
+        </w:tc>
+        <w:tc>
+          <w:tcPr>
+            <w:tcW w:type="dxa" w:w="1872"/>
+            <w:shd w:fill="FFFFFF"/>
+            <w:tcMar>
+              <w:top w:w="120" w:type="dxa"/>
+              <w:bottom w:w="120" w:type="dxa"/>
+              <w:left w:w="160" w:type="dxa"/>
+              <w:right w:w="160" w:type="dxa"/>
+            </w:tcMar>
+            <w:vAlign w:val="center"/>
+          </w:tcPr>
+          <w:p>
+            <w:pPr>
+              <w:spacing w:before="20" w:after="20" w:line="276" w:lineRule="auto"/>
+            </w:pPr>
+            <w:r>
+              <w:rPr>
+                <w:rFonts w:ascii="Segoe UI" w:hAnsi="Segoe UI"/>
+                <w:sz w:val="19"/>
+              </w:rPr>
+              <w:t>Thống kê KPI: người dùng, tin đăng, đơn ứng tuyển, đánh giá</w:t>
+            </w:r>
+          </w:p>
+        </w:tc>
+      </w:tr>
+      <w:tr>
+        <w:tc>
+          <w:tcPr>
+            <w:tcW w:type="dxa" w:w="1872"/>
+            <w:shd w:fill="F8FAFC"/>
+            <w:tcMar>
+              <w:top w:w="120" w:type="dxa"/>
+              <w:bottom w:w="120" w:type="dxa"/>
+              <w:left w:w="160" w:type="dxa"/>
+              <w:right w:w="160" w:type="dxa"/>
+            </w:tcMar>
+            <w:vAlign w:val="center"/>
+          </w:tcPr>
+          <w:p>
+            <w:pPr>
+              <w:spacing w:before="20" w:after="20" w:line="276" w:lineRule="auto"/>
+            </w:pPr>
+          </w:p>
+        </w:tc>
+        <w:tc>
+          <w:tcPr>
+            <w:tcW w:type="dxa" w:w="1872"/>
+            <w:shd w:fill="F8FAFC"/>
+            <w:tcMar>
+              <w:top w:w="120" w:type="dxa"/>
+              <w:bottom w:w="120" w:type="dxa"/>
+              <w:left w:w="160" w:type="dxa"/>
+              <w:right w:w="160" w:type="dxa"/>
+            </w:tcMar>
+            <w:vAlign w:val="center"/>
+          </w:tcPr>
+          <w:p>
+            <w:pPr>
+              <w:spacing w:before="20" w:after="20" w:line="276" w:lineRule="auto"/>
+            </w:pPr>
+            <w:r>
+              <w:rPr>
+                <w:rFonts w:ascii="Consolas" w:hAnsi="Consolas"/>
+                <w:color w:val="B42828"/>
+                <w:sz w:val="19"/>
+              </w:rPr>
+              <w:t>GET</w:t>
+            </w:r>
+          </w:p>
+        </w:tc>
+        <w:tc>
+          <w:tcPr>
+            <w:tcW w:type="dxa" w:w="1872"/>
+            <w:shd w:fill="F8FAFC"/>
+            <w:tcMar>
+              <w:top w:w="120" w:type="dxa"/>
+              <w:bottom w:w="120" w:type="dxa"/>
+              <w:left w:w="160" w:type="dxa"/>
+              <w:right w:w="160" w:type="dxa"/>
+            </w:tcMar>
+            <w:vAlign w:val="center"/>
+          </w:tcPr>
+          <w:p>
+            <w:pPr>
+              <w:spacing w:before="20" w:after="20" w:line="276" w:lineRule="auto"/>
+            </w:pPr>
+            <w:r>
+              <w:rPr>
+                <w:rFonts w:ascii="Consolas" w:hAnsi="Consolas"/>
+                <w:color w:val="B42828"/>
+                <w:sz w:val="19"/>
+              </w:rPr>
+              <w:t>/admin/users</w:t>
             </w:r>
           </w:p>
         </w:tc>
@@ -4524,7 +5013,7 @@
                 <w:rFonts w:ascii="Segoe UI" w:hAnsi="Segoe UI"/>
                 <w:sz w:val="19"/>
               </w:rPr>
-              <w:t>Thống kê KPI: người dùng, tin đăng, đơn ứng tuyển, đánh giá</w:t>
+              <w:t>Xem danh sách toàn bộ tài khoản trong hệ thống</w:t>
             </w:r>
           </w:p>
         </w:tc>
@@ -4570,7 +5059,7 @@
                 <w:color w:val="B42828"/>
                 <w:sz w:val="19"/>
               </w:rPr>
-              <w:t>GET</w:t>
+              <w:t>PATCH</w:t>
             </w:r>
           </w:p>
         </w:tc>
@@ -4596,7 +5085,7 @@
                 <w:color w:val="B42828"/>
                 <w:sz w:val="19"/>
               </w:rPr>
-              <w:t>/admin/users</w:t>
+              <w:t>/admin/users/{id}/toggle-status</w:t>
             </w:r>
           </w:p>
         </w:tc>
@@ -4647,7 +5136,7 @@
                 <w:rFonts w:ascii="Segoe UI" w:hAnsi="Segoe UI"/>
                 <w:sz w:val="19"/>
               </w:rPr>
-              <w:t>Xem danh sách toàn bộ tài khoản trong hệ thống</w:t>
+              <w:t>Khóa hoặc kích hoạt lại tài khoản người dùng</w:t>
             </w:r>
           </w:p>
         </w:tc>
@@ -4693,7 +5182,7 @@
                 <w:color w:val="B42828"/>
                 <w:sz w:val="19"/>
               </w:rPr>
-              <w:t>PATCH</w:t>
+              <w:t>DELETE</w:t>
             </w:r>
           </w:p>
         </w:tc>
@@ -4719,7 +5208,7 @@
                 <w:color w:val="B42828"/>
                 <w:sz w:val="19"/>
               </w:rPr>
-              <w:t>/admin/users/{id}/toggle-status</w:t>
+              <w:t>/admin/jobs/{id}</w:t>
             </w:r>
           </w:p>
         </w:tc>
@@ -4753,129 +5242,6 @@
           <w:tcPr>
             <w:tcW w:type="dxa" w:w="1872"/>
             <w:shd w:fill="F8FAFC"/>
-            <w:tcMar>
-              <w:top w:w="120" w:type="dxa"/>
-              <w:bottom w:w="120" w:type="dxa"/>
-              <w:left w:w="160" w:type="dxa"/>
-              <w:right w:w="160" w:type="dxa"/>
-            </w:tcMar>
-            <w:vAlign w:val="center"/>
-          </w:tcPr>
-          <w:p>
-            <w:pPr>
-              <w:spacing w:before="20" w:after="20" w:line="276" w:lineRule="auto"/>
-            </w:pPr>
-            <w:r>
-              <w:rPr>
-                <w:rFonts w:ascii="Segoe UI" w:hAnsi="Segoe UI"/>
-                <w:sz w:val="19"/>
-              </w:rPr>
-              <w:t>Khóa hoặc kích hoạt lại tài khoản người dùng</w:t>
-            </w:r>
-          </w:p>
-        </w:tc>
-      </w:tr>
-      <w:tr>
-        <w:tc>
-          <w:tcPr>
-            <w:tcW w:type="dxa" w:w="1872"/>
-            <w:shd w:fill="FFFFFF"/>
-            <w:tcMar>
-              <w:top w:w="120" w:type="dxa"/>
-              <w:bottom w:w="120" w:type="dxa"/>
-              <w:left w:w="160" w:type="dxa"/>
-              <w:right w:w="160" w:type="dxa"/>
-            </w:tcMar>
-            <w:vAlign w:val="center"/>
-          </w:tcPr>
-          <w:p>
-            <w:pPr>
-              <w:spacing w:before="20" w:after="20" w:line="276" w:lineRule="auto"/>
-            </w:pPr>
-          </w:p>
-        </w:tc>
-        <w:tc>
-          <w:tcPr>
-            <w:tcW w:type="dxa" w:w="1872"/>
-            <w:shd w:fill="FFFFFF"/>
-            <w:tcMar>
-              <w:top w:w="120" w:type="dxa"/>
-              <w:bottom w:w="120" w:type="dxa"/>
-              <w:left w:w="160" w:type="dxa"/>
-              <w:right w:w="160" w:type="dxa"/>
-            </w:tcMar>
-            <w:vAlign w:val="center"/>
-          </w:tcPr>
-          <w:p>
-            <w:pPr>
-              <w:spacing w:before="20" w:after="20" w:line="276" w:lineRule="auto"/>
-            </w:pPr>
-            <w:r>
-              <w:rPr>
-                <w:rFonts w:ascii="Consolas" w:hAnsi="Consolas"/>
-                <w:color w:val="B42828"/>
-                <w:sz w:val="19"/>
-              </w:rPr>
-              <w:t>DELETE</w:t>
-            </w:r>
-          </w:p>
-        </w:tc>
-        <w:tc>
-          <w:tcPr>
-            <w:tcW w:type="dxa" w:w="1872"/>
-            <w:shd w:fill="FFFFFF"/>
-            <w:tcMar>
-              <w:top w:w="120" w:type="dxa"/>
-              <w:bottom w:w="120" w:type="dxa"/>
-              <w:left w:w="160" w:type="dxa"/>
-              <w:right w:w="160" w:type="dxa"/>
-            </w:tcMar>
-            <w:vAlign w:val="center"/>
-          </w:tcPr>
-          <w:p>
-            <w:pPr>
-              <w:spacing w:before="20" w:after="20" w:line="276" w:lineRule="auto"/>
-            </w:pPr>
-            <w:r>
-              <w:rPr>
-                <w:rFonts w:ascii="Consolas" w:hAnsi="Consolas"/>
-                <w:color w:val="B42828"/>
-                <w:sz w:val="19"/>
-              </w:rPr>
-              <w:t>/admin/jobs/{id}</w:t>
-            </w:r>
-          </w:p>
-        </w:tc>
-        <w:tc>
-          <w:tcPr>
-            <w:tcW w:type="dxa" w:w="1872"/>
-            <w:shd w:fill="FFFFFF"/>
-            <w:tcMar>
-              <w:top w:w="120" w:type="dxa"/>
-              <w:bottom w:w="120" w:type="dxa"/>
-              <w:left w:w="160" w:type="dxa"/>
-              <w:right w:w="160" w:type="dxa"/>
-            </w:tcMar>
-            <w:vAlign w:val="center"/>
-          </w:tcPr>
-          <w:p>
-            <w:pPr>
-              <w:spacing w:before="20" w:after="20" w:line="276" w:lineRule="auto"/>
-            </w:pPr>
-            <w:r>
-              <w:rPr>
-                <w:rFonts w:ascii="Consolas" w:hAnsi="Consolas"/>
-                <w:color w:val="B42828"/>
-                <w:sz w:val="19"/>
-              </w:rPr>
-              <w:t>ROLE_ADMIN</w:t>
-            </w:r>
-          </w:p>
-        </w:tc>
-        <w:tc>
-          <w:tcPr>
-            <w:tcW w:type="dxa" w:w="1872"/>
-            <w:shd w:fill="FFFFFF"/>
             <w:tcMar>
               <w:top w:w="120" w:type="dxa"/>
               <w:bottom w:w="120" w:type="dxa"/>
@@ -5640,17 +6006,37 @@
         </w:rPr>
         <w:t>{</w:t>
         <w:br/>
-        <w:t xml:space="preserve">  "name": "Freelance Student Marketplace API",</w:t>
+        <w:t xml:space="preserve">  "status": "UP",</w:t>
+        <w:br/>
+        <w:t xml:space="preserve">  "system": "FreelanceHub - Hệ sinh thái việc làm sinh viên Nhóm 8",</w:t>
         <w:br/>
         <w:t xml:space="preserve">  "version": "1.0.0",</w:t>
         <w:br/>
-        <w:t xml:space="preserve">  "status": "UP",</w:t>
+        <w:t xml:space="preserve">  "swaggerDocs": "/api/v1/swagger-ui.html",</w:t>
         <w:br/>
-        <w:t xml:space="preserve">  "docs": "/api/v1/swagger-ui.html",</w:t>
+        <w:t xml:space="preserve">  "apiDocs": "/api/v1/api-docs",</w:t>
         <w:br/>
         <w:t xml:space="preserve">  "h2Console": "/api/v1/h2-console",</w:t>
         <w:br/>
-        <w:t xml:space="preserve">  "timestamp": 1728578400000</w:t>
+        <w:t xml:space="preserve">  "availableEndpoints": {</w:t>
+        <w:br/>
+        <w:t xml:space="preserve">    "auth": "/api/v1/auth",</w:t>
+        <w:br/>
+        <w:t xml:space="preserve">    "jobs": "/api/v1/jobs",</w:t>
+        <w:br/>
+        <w:t xml:space="preserve">    "categories": "/api/v1/categories",</w:t>
+        <w:br/>
+        <w:t xml:space="preserve">    "applications": "/api/v1/applications",</w:t>
+        <w:br/>
+        <w:t xml:space="preserve">    "reviews": "/api/v1/reviews",</w:t>
+        <w:br/>
+        <w:t xml:space="preserve">    "users": "/api/v1/users",</w:t>
+        <w:br/>
+        <w:t xml:space="preserve">    "notifications": "/api/v1/notifications",</w:t>
+        <w:br/>
+        <w:t xml:space="preserve">    "admin": "/api/v1/admin"</w:t>
+        <w:br/>
+        <w:t xml:space="preserve">  }</w:t>
         <w:br/>
         <w:t>}</w:t>
       </w:r>

</xml_diff>